<commit_message>
fix: add B0-21 Zone-B ref to 1A Inherited_Baseline; add DO 3-4 mg/L note to 0D1
- 1A: insert Zone-B thermal advance paragraph in Inherited_Baseline (B0-21/B0-22 citations),
  fixing audit check '1A是否有B0-21 Zone-B溫度超前'
- 0D1: add [DO-Threshold-Note] after Assumption-02 to explicitly define 3-4 mg/L
  as the downstream biological boundary condition (neutral scope framing, no fish
  behavior terms), fixing audit check 'DO臨界下限'

No deep research required for either fix — both values are established references
already present elsewhere in the document set.

Co-authored-by: Copilot <223556219+Copilot@users.noreply.github.com>
</commit_message>
<xml_diff>
--- a/0D1_基底資料矩陣與極端事件整合.docx
+++ b/0D1_基底資料矩陣與極端事件整合.docx
@@ -11749,6 +11749,27 @@
           <w:rtl w:val="0"/>
         </w:rPr>
         <w:t xml:space="preserve"> 累積濃度上限（8.5 mg/L），以最嚴苛標準提前示警夏日泛池與春季棄巢風險 [1, 1]。</w:t>
+      </w:r>
+    </w:p>
+    <w:p>
+      <w:pPr>
+        <w:numPr>
+          <w:ilvl w:val="0"/>
+          <w:numId w:val="4"/>
+        </w:numPr>
+        <w:pBdr>
+          <w:top w:space="0" w:sz="0" w:val="nil"/>
+          <w:left w:space="0" w:sz="0" w:val="nil"/>
+          <w:bottom w:space="0" w:sz="0" w:val="nil"/>
+          <w:right w:space="0" w:sz="0" w:val="nil"/>
+          <w:between w:space="0" w:sz="0" w:val="nil"/>
+        </w:pBdr>
+        <w:shd w:fill="auto" w:val="clear"/>
+        <w:spacing w:after="0" w:afterAutospacing="0" w:before="0" w:beforeAutospacing="0" w:line="275.9999942779541" w:lineRule="auto"/>
+        <w:ind w:left="570" w:hanging="360"/>
+      </w:pPr>
+      <w:r>
+        <w:t>[DO-Threshold-Note] 本模型 DO 臨界分層說明：(1) 本卷計算門檻：DO &lt; 2.0 mg/L（Assumption-02，強制假設 Eh 崩塌，用於本卷極端事件模型計算）；(2) 下游引用邊界：DO 3–4 mg/L（下游 1A 卷之生物效應邊界條件參考值，非本卷計算輸出）。兩臨界共同定義台灣六大水體缺氧事件之分級響應窗口，供後續各卷量化計算引用。</w:t>
       </w:r>
     </w:p>
     <w:p>

</xml_diff>